<commit_message>
docs: record MUI v9 step 1 (design source) decisions
- Tech-Recommendations §2.3.1: pin @mui/material 9.4.0, explain the
  vendored bundle (design/mui-vendor -> shared/vendor) and its 256 KiB
  per-file cap, and scope step 1 to web artboards.
- Design-System §6-§9: web takes MUI's stock shape, elevation and
  components; the existing tables stay the mobile spec. Legacy class to
  MUI component map. §12.2: token to MUI palette mapping.
- CLAUDE.md status line; sync-design-handoff knows shared/vendor is
  build output.
- Regenerated Design-System.docx and Tech-Recommendations.docx (pandoc,
  existing titles kept).

Co-Authored-By: Claude Opus 5.5 <noreply@anthropic.com>
</commit_message>
<xml_diff>
--- a/docs/Design-System.docx
+++ b/docs/Design-System.docx
@@ -7082,6 +7082,66 @@
         <w:t xml:space="preserve">6. Shape Scale</w:t>
       </w:r>
     </w:p>
+    <w:p>
+      <w:pPr>
+        <w:pStyle w:val="BlockText"/>
+      </w:pPr>
+      <w:r>
+        <w:rPr>
+          <w:b/>
+          <w:bCs/>
+        </w:rPr>
+        <w:t xml:space="preserve">Web uses MUI defaults (decided 2026-09-30).</w:t>
+      </w:r>
+      <w:r>
+        <w:t xml:space="preserve"> </w:t>
+      </w:r>
+      <w:r>
+        <w:t xml:space="preserve">The scale below is the mobile (Compose) spec and the legacy prototype spec. Web artboards and</w:t>
+      </w:r>
+      <w:r>
+        <w:t xml:space="preserve"> </w:t>
+      </w:r>
+      <w:r>
+        <w:rPr>
+          <w:rStyle w:val="VerbatimChar"/>
+        </w:rPr>
+        <w:t xml:space="preserve">web/</w:t>
+      </w:r>
+      <w:r>
+        <w:t xml:space="preserve"> </w:t>
+      </w:r>
+      <w:r>
+        <w:t xml:space="preserve">take MUI v9’s stock shape instead:</w:t>
+      </w:r>
+      <w:r>
+        <w:t xml:space="preserve"> </w:t>
+      </w:r>
+      <w:r>
+        <w:rPr>
+          <w:rStyle w:val="VerbatimChar"/>
+        </w:rPr>
+        <w:t xml:space="preserve">theme.shape.borderRadius</w:t>
+      </w:r>
+      <w:r>
+        <w:t xml:space="preserve"> </w:t>
+      </w:r>
+      <w:r>
+        <w:t xml:space="preserve">= 4px for buttons, inputs, cards and chips (chips stay pill-shaped by MUI default). Don’t re-add these radii with</w:t>
+      </w:r>
+      <w:r>
+        <w:t xml:space="preserve"> </w:t>
+      </w:r>
+      <w:r>
+        <w:rPr>
+          <w:rStyle w:val="VerbatimChar"/>
+        </w:rPr>
+        <w:t xml:space="preserve">sx</w:t>
+      </w:r>
+      <w:r>
+        <w:t xml:space="preserve">. See §12.2.</w:t>
+      </w:r>
+    </w:p>
     <w:tbl>
       <w:tblPr>
         <w:tblStyle w:val="Table"/>
@@ -7375,6 +7435,60 @@
       </w:pPr>
       <w:r>
         <w:t xml:space="preserve">7. Elevation / Shadow</w:t>
+      </w:r>
+    </w:p>
+    <w:p>
+      <w:pPr>
+        <w:pStyle w:val="BlockText"/>
+      </w:pPr>
+      <w:r>
+        <w:rPr>
+          <w:b/>
+          <w:bCs/>
+        </w:rPr>
+        <w:t xml:space="preserve">Web uses MUI defaults (decided 2026-09-30).</w:t>
+      </w:r>
+      <w:r>
+        <w:t xml:space="preserve"> </w:t>
+      </w:r>
+      <w:r>
+        <w:t xml:space="preserve">Web uses MUI’s stock</w:t>
+      </w:r>
+      <w:r>
+        <w:t xml:space="preserve"> </w:t>
+      </w:r>
+      <w:r>
+        <w:rPr>
+          <w:rStyle w:val="VerbatimChar"/>
+        </w:rPr>
+        <w:t xml:space="preserve">theme.shadows</w:t>
+      </w:r>
+      <w:r>
+        <w:t xml:space="preserve"> </w:t>
+      </w:r>
+      <w:r>
+        <w:t xml:space="preserve">scale (</w:t>
+      </w:r>
+      <w:r>
+        <w:rPr>
+          <w:rStyle w:val="VerbatimChar"/>
+        </w:rPr>
+        <w:t xml:space="preserve">boxShadow: 1…24</w:t>
+      </w:r>
+      <w:r>
+        <w:t xml:space="preserve">,</w:t>
+      </w:r>
+      <w:r>
+        <w:t xml:space="preserve"> </w:t>
+      </w:r>
+      <w:r>
+        <w:rPr>
+          <w:rStyle w:val="VerbatimChar"/>
+        </w:rPr>
+        <w:t xml:space="preserve">Paper elevation</w:t>
+      </w:r>
+      <w:r>
+        <w:t xml:space="preserve">). The four tiers below map roughly to elevation 1 / 2 / 4 / 8. The tables stay the spec for mobile.</w:t>
       </w:r>
     </w:p>
     <w:p>
@@ -7619,6 +7733,863 @@
     </w:p>
     <w:p>
       <w:pPr>
+        <w:pStyle w:val="BlockText"/>
+      </w:pPr>
+      <w:r>
+        <w:rPr>
+          <w:b/>
+          <w:bCs/>
+        </w:rPr>
+        <w:t xml:space="preserve">Web: MUI components (decided 2026-09-30).</w:t>
+      </w:r>
+      <w:r>
+        <w:t xml:space="preserve"> </w:t>
+      </w:r>
+      <w:r>
+        <w:t xml:space="preserve">On web, each primitive below is a stock MUI v9 component in the Story-Tail theme, not a custom class. The class names below describe the mobile spec and the legacy prototype. The mapping:</w:t>
+      </w:r>
+    </w:p>
+    <w:tbl>
+      <w:tblPr>
+        <w:tblStyle w:val="Table"/>
+        <w:tblW w:type="pct" w:w="5000"/>
+        <w:tblLayout w:type="fixed"/>
+        <w:tblLook w:firstRow="1" w:lastRow="0" w:firstColumn="0" w:lastColumn="0" w:noHBand="0" w:noVBand="0" w:val="0020"/>
+      </w:tblPr>
+      <w:tblGrid>
+        <w:gridCol w:w="3960"/>
+        <w:gridCol w:w="3960"/>
+      </w:tblGrid>
+      <w:tr>
+        <w:trPr>
+          <w:tblHeader w:val="on"/>
+        </w:trPr>
+        <w:tc>
+          <w:tcPr/>
+          <w:p>
+            <w:pPr>
+              <w:pStyle w:val="Compact"/>
+            </w:pPr>
+            <w:r>
+              <w:t xml:space="preserve">Legacy</w:t>
+            </w:r>
+          </w:p>
+        </w:tc>
+        <w:tc>
+          <w:tcPr/>
+          <w:p>
+            <w:pPr>
+              <w:pStyle w:val="Compact"/>
+            </w:pPr>
+            <w:r>
+              <w:t xml:space="preserve">MUI</w:t>
+            </w:r>
+          </w:p>
+        </w:tc>
+      </w:tr>
+      <w:tr>
+        <w:tc>
+          <w:tcPr/>
+          <w:p>
+            <w:pPr>
+              <w:pStyle w:val="Compact"/>
+            </w:pPr>
+            <w:r>
+              <w:rPr>
+                <w:rStyle w:val="VerbatimChar"/>
+              </w:rPr>
+              <w:t xml:space="preserve">btn-filled</w:t>
+            </w:r>
+            <w:r>
+              <w:t xml:space="preserve"> </w:t>
+            </w:r>
+            <w:r>
+              <w:t xml:space="preserve">/</w:t>
+            </w:r>
+            <w:r>
+              <w:t xml:space="preserve"> </w:t>
+            </w:r>
+            <w:r>
+              <w:rPr>
+                <w:rStyle w:val="VerbatimChar"/>
+              </w:rPr>
+              <w:t xml:space="preserve">btn-tonal</w:t>
+            </w:r>
+            <w:r>
+              <w:t xml:space="preserve"> </w:t>
+            </w:r>
+            <w:r>
+              <w:t xml:space="preserve">/</w:t>
+            </w:r>
+            <w:r>
+              <w:t xml:space="preserve"> </w:t>
+            </w:r>
+            <w:r>
+              <w:rPr>
+                <w:rStyle w:val="VerbatimChar"/>
+              </w:rPr>
+              <w:t xml:space="preserve">btn-tertiary</w:t>
+            </w:r>
+            <w:r>
+              <w:t xml:space="preserve"> </w:t>
+            </w:r>
+            <w:r>
+              <w:t xml:space="preserve">/</w:t>
+            </w:r>
+            <w:r>
+              <w:t xml:space="preserve"> </w:t>
+            </w:r>
+            <w:r>
+              <w:rPr>
+                <w:rStyle w:val="VerbatimChar"/>
+              </w:rPr>
+              <w:t xml:space="preserve">btn-outlined</w:t>
+            </w:r>
+            <w:r>
+              <w:t xml:space="preserve"> </w:t>
+            </w:r>
+            <w:r>
+              <w:t xml:space="preserve">/</w:t>
+            </w:r>
+            <w:r>
+              <w:t xml:space="preserve"> </w:t>
+            </w:r>
+            <w:r>
+              <w:rPr>
+                <w:rStyle w:val="VerbatimChar"/>
+              </w:rPr>
+              <w:t xml:space="preserve">btn-text</w:t>
+            </w:r>
+          </w:p>
+        </w:tc>
+        <w:tc>
+          <w:tcPr/>
+          <w:p>
+            <w:pPr>
+              <w:pStyle w:val="Compact"/>
+            </w:pPr>
+            <w:r>
+              <w:rPr>
+                <w:rStyle w:val="VerbatimChar"/>
+              </w:rPr>
+              <w:t xml:space="preserve">Button</w:t>
+            </w:r>
+            <w:r>
+              <w:t xml:space="preserve"> </w:t>
+            </w:r>
+            <w:r>
+              <w:t xml:space="preserve">contained / outlined</w:t>
+            </w:r>
+            <w:r>
+              <w:t xml:space="preserve"> </w:t>
+            </w:r>
+            <w:r>
+              <w:rPr>
+                <w:rStyle w:val="VerbatimChar"/>
+              </w:rPr>
+              <w:t xml:space="preserve">secondary</w:t>
+            </w:r>
+            <w:r>
+              <w:t xml:space="preserve"> </w:t>
+            </w:r>
+            <w:r>
+              <w:t xml:space="preserve">/ outlined</w:t>
+            </w:r>
+            <w:r>
+              <w:t xml:space="preserve"> </w:t>
+            </w:r>
+            <w:r>
+              <w:rPr>
+                <w:rStyle w:val="VerbatimChar"/>
+              </w:rPr>
+              <w:t xml:space="preserve">tertiary</w:t>
+            </w:r>
+            <w:r>
+              <w:t xml:space="preserve"> </w:t>
+            </w:r>
+            <w:r>
+              <w:t xml:space="preserve">/ outlined / text</w:t>
+            </w:r>
+          </w:p>
+        </w:tc>
+      </w:tr>
+      <w:tr>
+        <w:tc>
+          <w:tcPr/>
+          <w:p>
+            <w:pPr>
+              <w:pStyle w:val="Compact"/>
+            </w:pPr>
+            <w:r>
+              <w:rPr>
+                <w:rStyle w:val="VerbatimChar"/>
+              </w:rPr>
+              <w:t xml:space="preserve">btn-danger</w:t>
+            </w:r>
+            <w:r>
+              <w:t xml:space="preserve"> </w:t>
+            </w:r>
+            <w:r>
+              <w:t xml:space="preserve">/</w:t>
+            </w:r>
+            <w:r>
+              <w:t xml:space="preserve"> </w:t>
+            </w:r>
+            <w:r>
+              <w:rPr>
+                <w:rStyle w:val="VerbatimChar"/>
+              </w:rPr>
+              <w:t xml:space="preserve">btn-orange</w:t>
+            </w:r>
+            <w:r>
+              <w:t xml:space="preserve"> </w:t>
+            </w:r>
+            <w:r>
+              <w:t xml:space="preserve">/</w:t>
+            </w:r>
+            <w:r>
+              <w:t xml:space="preserve"> </w:t>
+            </w:r>
+            <w:r>
+              <w:rPr>
+                <w:rStyle w:val="VerbatimChar"/>
+              </w:rPr>
+              <w:t xml:space="preserve">btn-elevated</w:t>
+            </w:r>
+          </w:p>
+        </w:tc>
+        <w:tc>
+          <w:tcPr/>
+          <w:p>
+            <w:pPr>
+              <w:pStyle w:val="Compact"/>
+            </w:pPr>
+            <w:r>
+              <w:rPr>
+                <w:rStyle w:val="VerbatimChar"/>
+              </w:rPr>
+              <w:t xml:space="preserve">Button</w:t>
+            </w:r>
+            <w:r>
+              <w:t xml:space="preserve"> </w:t>
+            </w:r>
+            <w:r>
+              <w:t xml:space="preserve">contained</w:t>
+            </w:r>
+            <w:r>
+              <w:t xml:space="preserve"> </w:t>
+            </w:r>
+            <w:r>
+              <w:rPr>
+                <w:rStyle w:val="VerbatimChar"/>
+              </w:rPr>
+              <w:t xml:space="preserve">error</w:t>
+            </w:r>
+            <w:r>
+              <w:t xml:space="preserve"> </w:t>
+            </w:r>
+            <w:r>
+              <w:t xml:space="preserve">/ contained</w:t>
+            </w:r>
+            <w:r>
+              <w:t xml:space="preserve"> </w:t>
+            </w:r>
+            <w:r>
+              <w:rPr>
+                <w:rStyle w:val="VerbatimChar"/>
+              </w:rPr>
+              <w:t xml:space="preserve">brand</w:t>
+            </w:r>
+            <w:r>
+              <w:t xml:space="preserve"> </w:t>
+            </w:r>
+            <w:r>
+              <w:t xml:space="preserve">/ text on</w:t>
+            </w:r>
+            <w:r>
+              <w:t xml:space="preserve"> </w:t>
+            </w:r>
+            <w:r>
+              <w:rPr>
+                <w:rStyle w:val="VerbatimChar"/>
+              </w:rPr>
+              <w:t xml:space="preserve">background.paper</w:t>
+            </w:r>
+            <w:r>
+              <w:t xml:space="preserve"> </w:t>
+            </w:r>
+            <w:r>
+              <w:t xml:space="preserve">+</w:t>
+            </w:r>
+            <w:r>
+              <w:t xml:space="preserve"> </w:t>
+            </w:r>
+            <w:r>
+              <w:rPr>
+                <w:rStyle w:val="VerbatimChar"/>
+              </w:rPr>
+              <w:t xml:space="preserve">boxShadow: 1</w:t>
+            </w:r>
+          </w:p>
+        </w:tc>
+      </w:tr>
+      <w:tr>
+        <w:tc>
+          <w:tcPr/>
+          <w:p>
+            <w:pPr>
+              <w:pStyle w:val="Compact"/>
+            </w:pPr>
+            <w:r>
+              <w:rPr>
+                <w:rStyle w:val="VerbatimChar"/>
+              </w:rPr>
+              <w:t xml:space="preserve">btn-sm</w:t>
+            </w:r>
+            <w:r>
+              <w:t xml:space="preserve"> </w:t>
+            </w:r>
+            <w:r>
+              <w:t xml:space="preserve">/</w:t>
+            </w:r>
+            <w:r>
+              <w:t xml:space="preserve"> </w:t>
+            </w:r>
+            <w:r>
+              <w:rPr>
+                <w:rStyle w:val="VerbatimChar"/>
+              </w:rPr>
+              <w:t xml:space="preserve">btn-lg</w:t>
+            </w:r>
+            <w:r>
+              <w:t xml:space="preserve">,</w:t>
+            </w:r>
+            <w:r>
+              <w:t xml:space="preserve"> </w:t>
+            </w:r>
+            <w:r>
+              <w:rPr>
+                <w:rStyle w:val="VerbatimChar"/>
+              </w:rPr>
+              <w:t xml:space="preserve">btn-icon</w:t>
+            </w:r>
+            <w:r>
+              <w:t xml:space="preserve">,</w:t>
+            </w:r>
+            <w:r>
+              <w:t xml:space="preserve"> </w:t>
+            </w:r>
+            <w:r>
+              <w:rPr>
+                <w:rStyle w:val="VerbatimChar"/>
+              </w:rPr>
+              <w:t xml:space="preserve">fab</w:t>
+            </w:r>
+          </w:p>
+        </w:tc>
+        <w:tc>
+          <w:tcPr/>
+          <w:p>
+            <w:pPr>
+              <w:pStyle w:val="Compact"/>
+            </w:pPr>
+            <w:r>
+              <w:rPr>
+                <w:rStyle w:val="VerbatimChar"/>
+              </w:rPr>
+              <w:t xml:space="preserve">size="small"</w:t>
+            </w:r>
+            <w:r>
+              <w:t xml:space="preserve"> </w:t>
+            </w:r>
+            <w:r>
+              <w:t xml:space="preserve">/</w:t>
+            </w:r>
+            <w:r>
+              <w:t xml:space="preserve"> </w:t>
+            </w:r>
+            <w:r>
+              <w:rPr>
+                <w:rStyle w:val="VerbatimChar"/>
+              </w:rPr>
+              <w:t xml:space="preserve">"large"</w:t>
+            </w:r>
+            <w:r>
+              <w:t xml:space="preserve">,</w:t>
+            </w:r>
+            <w:r>
+              <w:t xml:space="preserve"> </w:t>
+            </w:r>
+            <w:r>
+              <w:rPr>
+                <w:rStyle w:val="VerbatimChar"/>
+              </w:rPr>
+              <w:t xml:space="preserve">IconButton</w:t>
+            </w:r>
+            <w:r>
+              <w:t xml:space="preserve">,</w:t>
+            </w:r>
+            <w:r>
+              <w:t xml:space="preserve"> </w:t>
+            </w:r>
+            <w:r>
+              <w:rPr>
+                <w:rStyle w:val="VerbatimChar"/>
+              </w:rPr>
+              <w:t xml:space="preserve">Fab variant="extended"</w:t>
+            </w:r>
+          </w:p>
+        </w:tc>
+      </w:tr>
+      <w:tr>
+        <w:tc>
+          <w:tcPr/>
+          <w:p>
+            <w:pPr>
+              <w:pStyle w:val="Compact"/>
+            </w:pPr>
+            <w:r>
+              <w:rPr>
+                <w:rStyle w:val="VerbatimChar"/>
+              </w:rPr>
+              <w:t xml:space="preserve">card</w:t>
+            </w:r>
+            <w:r>
+              <w:t xml:space="preserve"> </w:t>
+            </w:r>
+            <w:r>
+              <w:t xml:space="preserve">/</w:t>
+            </w:r>
+            <w:r>
+              <w:t xml:space="preserve"> </w:t>
+            </w:r>
+            <w:r>
+              <w:rPr>
+                <w:rStyle w:val="VerbatimChar"/>
+              </w:rPr>
+              <w:t xml:space="preserve">card-elev</w:t>
+            </w:r>
+            <w:r>
+              <w:t xml:space="preserve"> </w:t>
+            </w:r>
+            <w:r>
+              <w:t xml:space="preserve">/</w:t>
+            </w:r>
+            <w:r>
+              <w:t xml:space="preserve"> </w:t>
+            </w:r>
+            <w:r>
+              <w:rPr>
+                <w:rStyle w:val="VerbatimChar"/>
+              </w:rPr>
+              <w:t xml:space="preserve">card-flat</w:t>
+            </w:r>
+            <w:r>
+              <w:t xml:space="preserve"> </w:t>
+            </w:r>
+            <w:r>
+              <w:t xml:space="preserve">/</w:t>
+            </w:r>
+            <w:r>
+              <w:t xml:space="preserve"> </w:t>
+            </w:r>
+            <w:r>
+              <w:rPr>
+                <w:rStyle w:val="VerbatimChar"/>
+              </w:rPr>
+              <w:t xml:space="preserve">card-tonal</w:t>
+            </w:r>
+          </w:p>
+        </w:tc>
+        <w:tc>
+          <w:tcPr/>
+          <w:p>
+            <w:pPr>
+              <w:pStyle w:val="Compact"/>
+            </w:pPr>
+            <w:r>
+              <w:rPr>
+                <w:rStyle w:val="VerbatimChar"/>
+              </w:rPr>
+              <w:t xml:space="preserve">Card</w:t>
+            </w:r>
+            <w:r>
+              <w:t xml:space="preserve"> </w:t>
+            </w:r>
+            <w:r>
+              <w:t xml:space="preserve">/</w:t>
+            </w:r>
+            <w:r>
+              <w:t xml:space="preserve"> </w:t>
+            </w:r>
+            <w:r>
+              <w:rPr>
+                <w:rStyle w:val="VerbatimChar"/>
+              </w:rPr>
+              <w:t xml:space="preserve">Card elevation={2}</w:t>
+            </w:r>
+            <w:r>
+              <w:t xml:space="preserve"> </w:t>
+            </w:r>
+            <w:r>
+              <w:t xml:space="preserve">/</w:t>
+            </w:r>
+            <w:r>
+              <w:t xml:space="preserve"> </w:t>
+            </w:r>
+            <w:r>
+              <w:rPr>
+                <w:rStyle w:val="VerbatimChar"/>
+              </w:rPr>
+              <w:t xml:space="preserve">Card variant="outlined"</w:t>
+            </w:r>
+            <w:r>
+              <w:t xml:space="preserve"> </w:t>
+            </w:r>
+            <w:r>
+              <w:t xml:space="preserve">on</w:t>
+            </w:r>
+            <w:r>
+              <w:t xml:space="preserve"> </w:t>
+            </w:r>
+            <w:r>
+              <w:rPr>
+                <w:rStyle w:val="VerbatimChar"/>
+              </w:rPr>
+              <w:t xml:space="preserve">surface.2</w:t>
+            </w:r>
+            <w:r>
+              <w:t xml:space="preserve"> </w:t>
+            </w:r>
+            <w:r>
+              <w:t xml:space="preserve">/</w:t>
+            </w:r>
+            <w:r>
+              <w:t xml:space="preserve"> </w:t>
+            </w:r>
+            <w:r>
+              <w:rPr>
+                <w:rStyle w:val="VerbatimChar"/>
+              </w:rPr>
+              <w:t xml:space="preserve">Paper elevation={0}</w:t>
+            </w:r>
+            <w:r>
+              <w:t xml:space="preserve"> </w:t>
+            </w:r>
+            <w:r>
+              <w:t xml:space="preserve">on</w:t>
+            </w:r>
+            <w:r>
+              <w:t xml:space="preserve"> </w:t>
+            </w:r>
+            <w:r>
+              <w:rPr>
+                <w:rStyle w:val="VerbatimChar"/>
+              </w:rPr>
+              <w:t xml:space="preserve">surface.3</w:t>
+            </w:r>
+          </w:p>
+        </w:tc>
+      </w:tr>
+      <w:tr>
+        <w:tc>
+          <w:tcPr/>
+          <w:p>
+            <w:pPr>
+              <w:pStyle w:val="Compact"/>
+            </w:pPr>
+            <w:r>
+              <w:rPr>
+                <w:rStyle w:val="VerbatimChar"/>
+              </w:rPr>
+              <w:t xml:space="preserve">chip</w:t>
+            </w:r>
+            <w:r>
+              <w:t xml:space="preserve">,</w:t>
+            </w:r>
+            <w:r>
+              <w:t xml:space="preserve"> </w:t>
+            </w:r>
+            <w:r>
+              <w:rPr>
+                <w:rStyle w:val="VerbatimChar"/>
+              </w:rPr>
+              <w:t xml:space="preserve">chip-filter</w:t>
+            </w:r>
+            <w:r>
+              <w:t xml:space="preserve">,</w:t>
+            </w:r>
+            <w:r>
+              <w:t xml:space="preserve"> </w:t>
+            </w:r>
+            <w:r>
+              <w:rPr>
+                <w:rStyle w:val="VerbatimChar"/>
+              </w:rPr>
+              <w:t xml:space="preserve">chip-status</w:t>
+            </w:r>
+          </w:p>
+        </w:tc>
+        <w:tc>
+          <w:tcPr/>
+          <w:p>
+            <w:pPr>
+              <w:pStyle w:val="Compact"/>
+            </w:pPr>
+            <w:r>
+              <w:rPr>
+                <w:rStyle w:val="VerbatimChar"/>
+              </w:rPr>
+              <w:t xml:space="preserve">Chip variant="outlined"</w:t>
+            </w:r>
+            <w:r>
+              <w:t xml:space="preserve">,</w:t>
+            </w:r>
+            <w:r>
+              <w:t xml:space="preserve"> </w:t>
+            </w:r>
+            <w:r>
+              <w:rPr>
+                <w:rStyle w:val="VerbatimChar"/>
+              </w:rPr>
+              <w:t xml:space="preserve">Chip</w:t>
+            </w:r>
+            <w:r>
+              <w:t xml:space="preserve"> </w:t>
+            </w:r>
+            <w:r>
+              <w:t xml:space="preserve">(selected =</w:t>
+            </w:r>
+            <w:r>
+              <w:t xml:space="preserve"> </w:t>
+            </w:r>
+            <w:r>
+              <w:rPr>
+                <w:rStyle w:val="VerbatimChar"/>
+              </w:rPr>
+              <w:t xml:space="preserve">color="secondary"</w:t>
+            </w:r>
+            <w:r>
+              <w:t xml:space="preserve">),</w:t>
+            </w:r>
+            <w:r>
+              <w:t xml:space="preserve"> </w:t>
+            </w:r>
+            <w:r>
+              <w:rPr>
+                <w:rStyle w:val="VerbatimChar"/>
+              </w:rPr>
+              <w:t xml:space="preserve">MuiStaStatus</w:t>
+            </w:r>
+            <w:r>
+              <w:t xml:space="preserve"> </w:t>
+            </w:r>
+            <w:r>
+              <w:t xml:space="preserve">(colors from §4.3)</w:t>
+            </w:r>
+          </w:p>
+        </w:tc>
+      </w:tr>
+      <w:tr>
+        <w:tc>
+          <w:tcPr/>
+          <w:p>
+            <w:pPr>
+              <w:pStyle w:val="Compact"/>
+            </w:pPr>
+            <w:r>
+              <w:rPr>
+                <w:rStyle w:val="VerbatimChar"/>
+              </w:rPr>
+              <w:t xml:space="preserve">field-label</w:t>
+            </w:r>
+            <w:r>
+              <w:t xml:space="preserve"> </w:t>
+            </w:r>
+            <w:r>
+              <w:t xml:space="preserve">+</w:t>
+            </w:r>
+            <w:r>
+              <w:t xml:space="preserve"> </w:t>
+            </w:r>
+            <w:r>
+              <w:rPr>
+                <w:rStyle w:val="VerbatimChar"/>
+              </w:rPr>
+              <w:t xml:space="preserve">input</w:t>
+            </w:r>
+            <w:r>
+              <w:t xml:space="preserve">,</w:t>
+            </w:r>
+            <w:r>
+              <w:t xml:space="preserve"> </w:t>
+            </w:r>
+            <w:r>
+              <w:rPr>
+                <w:rStyle w:val="VerbatimChar"/>
+              </w:rPr>
+              <w:t xml:space="preserve">&lt;select&gt;</w:t>
+            </w:r>
+          </w:p>
+        </w:tc>
+        <w:tc>
+          <w:tcPr/>
+          <w:p>
+            <w:pPr>
+              <w:pStyle w:val="Compact"/>
+            </w:pPr>
+            <w:r>
+              <w:rPr>
+                <w:rStyle w:val="VerbatimChar"/>
+              </w:rPr>
+              <w:t xml:space="preserve">TextField label=…</w:t>
+            </w:r>
+            <w:r>
+              <w:t xml:space="preserve">,</w:t>
+            </w:r>
+            <w:r>
+              <w:t xml:space="preserve"> </w:t>
+            </w:r>
+            <w:r>
+              <w:rPr>
+                <w:rStyle w:val="VerbatimChar"/>
+              </w:rPr>
+              <w:t xml:space="preserve">TextField select</w:t>
+            </w:r>
+          </w:p>
+        </w:tc>
+      </w:tr>
+      <w:tr>
+        <w:tc>
+          <w:tcPr/>
+          <w:p>
+            <w:pPr>
+              <w:pStyle w:val="Compact"/>
+            </w:pPr>
+            <w:r>
+              <w:rPr>
+                <w:rStyle w:val="VerbatimChar"/>
+              </w:rPr>
+              <w:t xml:space="preserve">avatar</w:t>
+            </w:r>
+          </w:p>
+        </w:tc>
+        <w:tc>
+          <w:tcPr/>
+          <w:p>
+            <w:pPr>
+              <w:pStyle w:val="Compact"/>
+            </w:pPr>
+            <w:r>
+              <w:rPr>
+                <w:rStyle w:val="VerbatimChar"/>
+              </w:rPr>
+              <w:t xml:space="preserve">Avatar</w:t>
+            </w:r>
+          </w:p>
+        </w:tc>
+      </w:tr>
+      <w:tr>
+        <w:tc>
+          <w:tcPr/>
+          <w:p>
+            <w:pPr>
+              <w:pStyle w:val="Compact"/>
+            </w:pPr>
+            <w:r>
+              <w:rPr>
+                <w:rStyle w:val="VerbatimChar"/>
+              </w:rPr>
+              <w:t xml:space="preserve">t-display</w:t>
+            </w:r>
+            <w:r>
+              <w:t xml:space="preserve"> </w:t>
+            </w:r>
+            <w:r>
+              <w:t xml:space="preserve">…</w:t>
+            </w:r>
+            <w:r>
+              <w:t xml:space="preserve"> </w:t>
+            </w:r>
+            <w:r>
+              <w:rPr>
+                <w:rStyle w:val="VerbatimChar"/>
+              </w:rPr>
+              <w:t xml:space="preserve">t-label-s</w:t>
+            </w:r>
+          </w:p>
+        </w:tc>
+        <w:tc>
+          <w:tcPr/>
+          <w:p>
+            <w:pPr>
+              <w:pStyle w:val="Compact"/>
+            </w:pPr>
+            <w:r>
+              <w:rPr>
+                <w:rStyle w:val="VerbatimChar"/>
+              </w:rPr>
+              <w:t xml:space="preserve">Typography</w:t>
+            </w:r>
+            <w:r>
+              <w:t xml:space="preserve"> </w:t>
+            </w:r>
+            <w:r>
+              <w:t xml:space="preserve">h2, h3, h4, h5, h6, subtitle1, body1, body2, caption, overline;</w:t>
+            </w:r>
+            <w:r>
+              <w:t xml:space="preserve"> </w:t>
+            </w:r>
+            <w:r>
+              <w:rPr>
+                <w:rStyle w:val="VerbatimChar"/>
+              </w:rPr>
+              <w:t xml:space="preserve">t-script</w:t>
+            </w:r>
+            <w:r>
+              <w:t xml:space="preserve"> </w:t>
+            </w:r>
+            <w:r>
+              <w:t xml:space="preserve">= custom</w:t>
+            </w:r>
+            <w:r>
+              <w:t xml:space="preserve"> </w:t>
+            </w:r>
+            <w:r>
+              <w:rPr>
+                <w:rStyle w:val="VerbatimChar"/>
+              </w:rPr>
+              <w:t xml:space="preserve">script</w:t>
+            </w:r>
+            <w:r>
+              <w:t xml:space="preserve"> </w:t>
+            </w:r>
+            <w:r>
+              <w:t xml:space="preserve">variant (Caveat)</w:t>
+            </w:r>
+          </w:p>
+        </w:tc>
+      </w:tr>
+    </w:tbl>
+    <w:p>
+      <w:pPr>
+        <w:pStyle w:val="BlockText"/>
+      </w:pPr>
+      <w:r>
+        <w:t xml:space="preserve">Buttons are not all-caps (</w:t>
+      </w:r>
+      <w:r>
+        <w:rPr>
+          <w:rStyle w:val="VerbatimChar"/>
+        </w:rPr>
+        <w:t xml:space="preserve">typography.button.textTransform: 'none'</w:t>
+      </w:r>
+      <w:r>
+        <w:t xml:space="preserve">), because all-caps fights the warm voice in §2. That’s the only component override.</w:t>
+      </w:r>
+    </w:p>
+    <w:p>
+      <w:pPr>
         <w:pStyle w:val="FirstParagraph"/>
       </w:pPr>
       <w:r>
@@ -8529,6 +9500,129 @@
       </w:pPr>
       <w:r>
         <w:t xml:space="preserve">9. App Shell Components</w:t>
+      </w:r>
+    </w:p>
+    <w:p>
+      <w:pPr>
+        <w:pStyle w:val="BlockText"/>
+      </w:pPr>
+      <w:r>
+        <w:rPr>
+          <w:b/>
+          <w:bCs/>
+        </w:rPr>
+        <w:t xml:space="preserve">Web:</w:t>
+      </w:r>
+      <w:r>
+        <w:t xml:space="preserve"> </w:t>
+      </w:r>
+      <w:r>
+        <w:t xml:space="preserve">the MUI versions of these live in</w:t>
+      </w:r>
+      <w:r>
+        <w:t xml:space="preserve"> </w:t>
+      </w:r>
+      <w:r>
+        <w:rPr>
+          <w:rStyle w:val="VerbatimChar"/>
+        </w:rPr>
+        <w:t xml:space="preserve">design/source-prototype/shared/mui-kit.jsx</w:t>
+      </w:r>
+      <w:r>
+        <w:t xml:space="preserve"> </w:t>
+      </w:r>
+      <w:r>
+        <w:t xml:space="preserve">(</w:t>
+      </w:r>
+      <w:r>
+        <w:rPr>
+          <w:rStyle w:val="VerbatimChar"/>
+        </w:rPr>
+        <w:t xml:space="preserve">MuiScreenFrame</w:t>
+      </w:r>
+      <w:r>
+        <w:t xml:space="preserve">,</w:t>
+      </w:r>
+      <w:r>
+        <w:t xml:space="preserve"> </w:t>
+      </w:r>
+      <w:r>
+        <w:rPr>
+          <w:rStyle w:val="VerbatimChar"/>
+        </w:rPr>
+        <w:t xml:space="preserve">MuiStaTopBar</w:t>
+      </w:r>
+      <w:r>
+        <w:t xml:space="preserve">,</w:t>
+      </w:r>
+      <w:r>
+        <w:t xml:space="preserve"> </w:t>
+      </w:r>
+      <w:r>
+        <w:rPr>
+          <w:rStyle w:val="VerbatimChar"/>
+        </w:rPr>
+        <w:t xml:space="preserve">MuiStaNavRail</w:t>
+      </w:r>
+      <w:r>
+        <w:t xml:space="preserve">, …). They have the same props and copy as the legacy shell, built from</w:t>
+      </w:r>
+      <w:r>
+        <w:t xml:space="preserve"> </w:t>
+      </w:r>
+      <w:r>
+        <w:rPr>
+          <w:rStyle w:val="VerbatimChar"/>
+        </w:rPr>
+        <w:t xml:space="preserve">AppBar</w:t>
+      </w:r>
+      <w:r>
+        <w:t xml:space="preserve">/</w:t>
+      </w:r>
+      <w:r>
+        <w:rPr>
+          <w:rStyle w:val="VerbatimChar"/>
+        </w:rPr>
+        <w:t xml:space="preserve">Toolbar</w:t>
+      </w:r>
+      <w:r>
+        <w:t xml:space="preserve">,</w:t>
+      </w:r>
+      <w:r>
+        <w:t xml:space="preserve"> </w:t>
+      </w:r>
+      <w:r>
+        <w:rPr>
+          <w:rStyle w:val="VerbatimChar"/>
+        </w:rPr>
+        <w:t xml:space="preserve">List</w:t>
+      </w:r>
+      <w:r>
+        <w:t xml:space="preserve">/</w:t>
+      </w:r>
+      <w:r>
+        <w:rPr>
+          <w:rStyle w:val="VerbatimChar"/>
+        </w:rPr>
+        <w:t xml:space="preserve">ListItemButton</w:t>
+      </w:r>
+      <w:r>
+        <w:t xml:space="preserve"> </w:t>
+      </w:r>
+      <w:r>
+        <w:t xml:space="preserve">and</w:t>
+      </w:r>
+      <w:r>
+        <w:t xml:space="preserve"> </w:t>
+      </w:r>
+      <w:r>
+        <w:rPr>
+          <w:rStyle w:val="VerbatimChar"/>
+        </w:rPr>
+        <w:t xml:space="preserve">Card</w:t>
+      </w:r>
+      <w:r>
+        <w:t xml:space="preserve">.</w:t>
       </w:r>
     </w:p>
     <w:p>
@@ -11228,7 +12322,99 @@
         <w:pStyle w:val="FirstParagraph"/>
       </w:pPr>
       <w:r>
-        <w:t xml:space="preserve">Styling approach is flexible — Tailwind CSS, CSS Modules, vanilla CSS, or any CSS-in-JS library can consume the variables. The design tokens are framework-agnostic; only the typing layer changes per styling choice.</w:t>
+        <w:t xml:space="preserve">The design tokens are framework-agnostic — Tailwind CSS, CSS Modules, vanilla CSS, or any CSS-in-JS library can consume them; only the typing layer changes per styling choice.</w:t>
+      </w:r>
+      <w:r>
+        <w:t xml:space="preserve"> </w:t>
+      </w:r>
+      <w:r>
+        <w:rPr>
+          <w:b/>
+          <w:bCs/>
+        </w:rPr>
+        <w:t xml:space="preserve">Current implementation uses Tailwind CSS v4</w:t>
+      </w:r>
+      <w:r>
+        <w:t xml:space="preserve"> </w:t>
+      </w:r>
+      <w:r>
+        <w:t xml:space="preserve">(see the example below), but</w:t>
+      </w:r>
+      <w:r>
+        <w:t xml:space="preserve"> </w:t>
+      </w:r>
+      <w:r>
+        <w:rPr>
+          <w:b/>
+          <w:bCs/>
+        </w:rPr>
+        <w:t xml:space="preserve">MUI (Material UI) is the planned target styling library</w:t>
+      </w:r>
+      <w:r>
+        <w:t xml:space="preserve"> </w:t>
+      </w:r>
+      <w:r>
+        <w:t xml:space="preserve">— Gyasi has decided to replace Tailwind with MUI, with an MUI</w:t>
+      </w:r>
+      <w:r>
+        <w:t xml:space="preserve"> </w:t>
+      </w:r>
+      <w:r>
+        <w:rPr>
+          <w:rStyle w:val="VerbatimChar"/>
+        </w:rPr>
+        <w:t xml:space="preserve">ThemeProvider</w:t>
+      </w:r>
+      <w:r>
+        <w:t xml:space="preserve"> </w:t>
+      </w:r>
+      <w:r>
+        <w:t xml:space="preserve">consuming these same token values rather than a parallel set of design decisions. This is a natural fit since the color tokens in Section 4 are already Material-3-based. See</w:t>
+      </w:r>
+      <w:r>
+        <w:t xml:space="preserve"> </w:t>
+      </w:r>
+      <w:r>
+        <w:rPr>
+          <w:rStyle w:val="VerbatimChar"/>
+        </w:rPr>
+        <w:t xml:space="preserve">docs/Tech-Recommendations.md</w:t>
+      </w:r>
+      <w:r>
+        <w:t xml:space="preserve"> </w:t>
+      </w:r>
+      <w:r>
+        <w:t xml:space="preserve">§2.3.1 for the phased migration plan (design source updated to MUI first, then</w:t>
+      </w:r>
+      <w:r>
+        <w:t xml:space="preserve"> </w:t>
+      </w:r>
+      <w:r>
+        <w:rPr>
+          <w:rStyle w:val="VerbatimChar"/>
+        </w:rPr>
+        <w:t xml:space="preserve">web/</w:t>
+      </w:r>
+      <w:r>
+        <w:t xml:space="preserve"> </w:t>
+      </w:r>
+      <w:r>
+        <w:t xml:space="preserve">implementation) — step 1 of that migration (the design source) started 2026-09-30, and</w:t>
+      </w:r>
+      <w:r>
+        <w:t xml:space="preserve"> </w:t>
+      </w:r>
+      <w:r>
+        <w:rPr>
+          <w:rStyle w:val="VerbatimChar"/>
+        </w:rPr>
+        <w:t xml:space="preserve">web/</w:t>
+      </w:r>
+      <w:r>
+        <w:t xml:space="preserve"> </w:t>
+      </w:r>
+      <w:r>
+        <w:t xml:space="preserve">itself has not started.</w:t>
       </w:r>
     </w:p>
     <w:p>
@@ -11236,7 +12422,753 @@
         <w:pStyle w:val="BodyText"/>
       </w:pPr>
       <w:r>
-        <w:t xml:space="preserve">If using Tailwind, extend</w:t>
+        <w:rPr>
+          <w:b/>
+          <w:bCs/>
+        </w:rPr>
+        <w:t xml:space="preserve">MUI theme (the target).</w:t>
+      </w:r>
+      <w:r>
+        <w:t xml:space="preserve"> </w:t>
+      </w:r>
+      <w:r>
+        <w:t xml:space="preserve">The token → MUI mapping lives in</w:t>
+      </w:r>
+      <w:r>
+        <w:t xml:space="preserve"> </w:t>
+      </w:r>
+      <w:r>
+        <w:rPr>
+          <w:rStyle w:val="VerbatimChar"/>
+        </w:rPr>
+        <w:t xml:space="preserve">design/source-prototype/shared/mui-theme.jsx</w:t>
+      </w:r>
+      <w:r>
+        <w:t xml:space="preserve">. It builds two</w:t>
+      </w:r>
+      <w:r>
+        <w:t xml:space="preserve"> </w:t>
+      </w:r>
+      <w:r>
+        <w:rPr>
+          <w:rStyle w:val="VerbatimChar"/>
+        </w:rPr>
+        <w:t xml:space="preserve">createTheme</w:t>
+      </w:r>
+      <w:r>
+        <w:t xml:space="preserve"> </w:t>
+      </w:r>
+      <w:r>
+        <w:t xml:space="preserve">results (light, dark) with every value copied 1:1 from</w:t>
+      </w:r>
+      <w:r>
+        <w:t xml:space="preserve"> </w:t>
+      </w:r>
+      <w:r>
+        <w:rPr>
+          <w:rStyle w:val="VerbatimChar"/>
+        </w:rPr>
+        <w:t xml:space="preserve">tokens.css</w:t>
+      </w:r>
+      <w:r>
+        <w:t xml:space="preserve">. There are two themes rather than</w:t>
+      </w:r>
+      <w:r>
+        <w:t xml:space="preserve"> </w:t>
+      </w:r>
+      <w:r>
+        <w:rPr>
+          <w:rStyle w:val="VerbatimChar"/>
+        </w:rPr>
+        <w:t xml:space="preserve">colorSchemes</w:t>
+      </w:r>
+      <w:r>
+        <w:t xml:space="preserve">, because one page renders the same artboard in both schemes side by side:</w:t>
+      </w:r>
+    </w:p>
+    <w:tbl>
+      <w:tblPr>
+        <w:tblStyle w:val="Table"/>
+        <w:tblW w:type="pct" w:w="5000"/>
+        <w:tblLayout w:type="fixed"/>
+        <w:tblLook w:firstRow="1" w:lastRow="0" w:firstColumn="0" w:lastColumn="0" w:noHBand="0" w:noVBand="0" w:val="0020"/>
+      </w:tblPr>
+      <w:tblGrid>
+        <w:gridCol w:w="3960"/>
+        <w:gridCol w:w="3960"/>
+      </w:tblGrid>
+      <w:tr>
+        <w:trPr>
+          <w:tblHeader w:val="on"/>
+        </w:trPr>
+        <w:tc>
+          <w:tcPr/>
+          <w:p>
+            <w:pPr>
+              <w:pStyle w:val="Compact"/>
+            </w:pPr>
+            <w:r>
+              <w:t xml:space="preserve">MUI palette path</w:t>
+            </w:r>
+          </w:p>
+        </w:tc>
+        <w:tc>
+          <w:tcPr/>
+          <w:p>
+            <w:pPr>
+              <w:pStyle w:val="Compact"/>
+            </w:pPr>
+            <w:r>
+              <w:t xml:space="preserve">Token</w:t>
+            </w:r>
+          </w:p>
+        </w:tc>
+      </w:tr>
+      <w:tr>
+        <w:tc>
+          <w:tcPr/>
+          <w:p>
+            <w:pPr>
+              <w:pStyle w:val="Compact"/>
+            </w:pPr>
+            <w:r>
+              <w:rPr>
+                <w:rStyle w:val="VerbatimChar"/>
+              </w:rPr>
+              <w:t xml:space="preserve">primary</w:t>
+            </w:r>
+            <w:r>
+              <w:t xml:space="preserve"> </w:t>
+            </w:r>
+            <w:r>
+              <w:t xml:space="preserve">/</w:t>
+            </w:r>
+            <w:r>
+              <w:t xml:space="preserve"> </w:t>
+            </w:r>
+            <w:r>
+              <w:rPr>
+                <w:rStyle w:val="VerbatimChar"/>
+              </w:rPr>
+              <w:t xml:space="preserve">secondary</w:t>
+            </w:r>
+            <w:r>
+              <w:t xml:space="preserve"> </w:t>
+            </w:r>
+            <w:r>
+              <w:t xml:space="preserve">/</w:t>
+            </w:r>
+            <w:r>
+              <w:t xml:space="preserve"> </w:t>
+            </w:r>
+            <w:r>
+              <w:rPr>
+                <w:rStyle w:val="VerbatimChar"/>
+              </w:rPr>
+              <w:t xml:space="preserve">error</w:t>
+            </w:r>
+            <w:r>
+              <w:t xml:space="preserve"> </w:t>
+            </w:r>
+            <w:r>
+              <w:t xml:space="preserve">(</w:t>
+            </w:r>
+            <w:r>
+              <w:rPr>
+                <w:rStyle w:val="VerbatimChar"/>
+              </w:rPr>
+              <w:t xml:space="preserve">.main</w:t>
+            </w:r>
+            <w:r>
+              <w:t xml:space="preserve">,</w:t>
+            </w:r>
+            <w:r>
+              <w:t xml:space="preserve"> </w:t>
+            </w:r>
+            <w:r>
+              <w:rPr>
+                <w:rStyle w:val="VerbatimChar"/>
+              </w:rPr>
+              <w:t xml:space="preserve">.contrastText</w:t>
+            </w:r>
+            <w:r>
+              <w:t xml:space="preserve">,</w:t>
+            </w:r>
+            <w:r>
+              <w:t xml:space="preserve"> </w:t>
+            </w:r>
+            <w:r>
+              <w:rPr>
+                <w:rStyle w:val="VerbatimChar"/>
+              </w:rPr>
+              <w:t xml:space="preserve">.container</w:t>
+            </w:r>
+            <w:r>
+              <w:t xml:space="preserve">,</w:t>
+            </w:r>
+            <w:r>
+              <w:t xml:space="preserve"> </w:t>
+            </w:r>
+            <w:r>
+              <w:rPr>
+                <w:rStyle w:val="VerbatimChar"/>
+              </w:rPr>
+              <w:t xml:space="preserve">.onContainer</w:t>
+            </w:r>
+            <w:r>
+              <w:t xml:space="preserve">)</w:t>
+            </w:r>
+          </w:p>
+        </w:tc>
+        <w:tc>
+          <w:tcPr/>
+          <w:p>
+            <w:pPr>
+              <w:pStyle w:val="Compact"/>
+            </w:pPr>
+            <w:r>
+              <w:rPr>
+                <w:rStyle w:val="VerbatimChar"/>
+              </w:rPr>
+              <w:t xml:space="preserve">--md-primary</w:t>
+            </w:r>
+            <w:r>
+              <w:t xml:space="preserve">,</w:t>
+            </w:r>
+            <w:r>
+              <w:t xml:space="preserve"> </w:t>
+            </w:r>
+            <w:r>
+              <w:rPr>
+                <w:rStyle w:val="VerbatimChar"/>
+              </w:rPr>
+              <w:t xml:space="preserve">--md-on-primary</w:t>
+            </w:r>
+            <w:r>
+              <w:t xml:space="preserve">,</w:t>
+            </w:r>
+            <w:r>
+              <w:t xml:space="preserve"> </w:t>
+            </w:r>
+            <w:r>
+              <w:rPr>
+                <w:rStyle w:val="VerbatimChar"/>
+              </w:rPr>
+              <w:t xml:space="preserve">--md-primary-container</w:t>
+            </w:r>
+            <w:r>
+              <w:t xml:space="preserve">,</w:t>
+            </w:r>
+            <w:r>
+              <w:t xml:space="preserve"> </w:t>
+            </w:r>
+            <w:r>
+              <w:rPr>
+                <w:rStyle w:val="VerbatimChar"/>
+              </w:rPr>
+              <w:t xml:space="preserve">--md-on-primary-container</w:t>
+            </w:r>
+            <w:r>
+              <w:t xml:space="preserve">, and the same for secondary / error</w:t>
+            </w:r>
+          </w:p>
+        </w:tc>
+      </w:tr>
+      <w:tr>
+        <w:tc>
+          <w:tcPr/>
+          <w:p>
+            <w:pPr>
+              <w:pStyle w:val="Compact"/>
+            </w:pPr>
+            <w:r>
+              <w:rPr>
+                <w:rStyle w:val="VerbatimChar"/>
+              </w:rPr>
+              <w:t xml:space="preserve">tertiary</w:t>
+            </w:r>
+            <w:r>
+              <w:t xml:space="preserve"> </w:t>
+            </w:r>
+            <w:r>
+              <w:t xml:space="preserve">(custom),</w:t>
+            </w:r>
+            <w:r>
+              <w:t xml:space="preserve"> </w:t>
+            </w:r>
+            <w:r>
+              <w:rPr>
+                <w:rStyle w:val="VerbatimChar"/>
+              </w:rPr>
+              <w:t xml:space="preserve">brand</w:t>
+            </w:r>
+            <w:r>
+              <w:t xml:space="preserve"> </w:t>
+            </w:r>
+            <w:r>
+              <w:t xml:space="preserve">(custom,</w:t>
+            </w:r>
+            <w:r>
+              <w:t xml:space="preserve"> </w:t>
+            </w:r>
+            <w:r>
+              <w:rPr>
+                <w:rStyle w:val="VerbatimChar"/>
+              </w:rPr>
+              <w:t xml:space="preserve">--brand-orange</w:t>
+            </w:r>
+            <w:r>
+              <w:t xml:space="preserve">)</w:t>
+            </w:r>
+          </w:p>
+        </w:tc>
+        <w:tc>
+          <w:tcPr/>
+          <w:p>
+            <w:pPr>
+              <w:pStyle w:val="Compact"/>
+            </w:pPr>
+            <w:r>
+              <w:rPr>
+                <w:rStyle w:val="VerbatimChar"/>
+              </w:rPr>
+              <w:t xml:space="preserve">--md-tertiary*</w:t>
+            </w:r>
+            <w:r>
+              <w:t xml:space="preserve">,</w:t>
+            </w:r>
+            <w:r>
+              <w:t xml:space="preserve"> </w:t>
+            </w:r>
+            <w:r>
+              <w:rPr>
+                <w:rStyle w:val="VerbatimChar"/>
+              </w:rPr>
+              <w:t xml:space="preserve">--brand-orange</w:t>
+            </w:r>
+          </w:p>
+        </w:tc>
+      </w:tr>
+      <w:tr>
+        <w:tc>
+          <w:tcPr/>
+          <w:p>
+            <w:pPr>
+              <w:pStyle w:val="Compact"/>
+            </w:pPr>
+            <w:r>
+              <w:rPr>
+                <w:rStyle w:val="VerbatimChar"/>
+              </w:rPr>
+              <w:t xml:space="preserve">success</w:t>
+            </w:r>
+            <w:r>
+              <w:t xml:space="preserve">,</w:t>
+            </w:r>
+            <w:r>
+              <w:t xml:space="preserve"> </w:t>
+            </w:r>
+            <w:r>
+              <w:rPr>
+                <w:rStyle w:val="VerbatimChar"/>
+              </w:rPr>
+              <w:t xml:space="preserve">warning</w:t>
+            </w:r>
+          </w:p>
+        </w:tc>
+        <w:tc>
+          <w:tcPr/>
+          <w:p>
+            <w:pPr>
+              <w:pStyle w:val="Compact"/>
+            </w:pPr>
+            <w:r>
+              <w:rPr>
+                <w:rStyle w:val="VerbatimChar"/>
+              </w:rPr>
+              <w:t xml:space="preserve">--md-success*</w:t>
+            </w:r>
+            <w:r>
+              <w:t xml:space="preserve">,</w:t>
+            </w:r>
+            <w:r>
+              <w:t xml:space="preserve"> </w:t>
+            </w:r>
+            <w:r>
+              <w:rPr>
+                <w:rStyle w:val="VerbatimChar"/>
+              </w:rPr>
+              <w:t xml:space="preserve">--md-warning*</w:t>
+            </w:r>
+          </w:p>
+        </w:tc>
+      </w:tr>
+      <w:tr>
+        <w:tc>
+          <w:tcPr/>
+          <w:p>
+            <w:pPr>
+              <w:pStyle w:val="Compact"/>
+            </w:pPr>
+            <w:r>
+              <w:rPr>
+                <w:rStyle w:val="VerbatimChar"/>
+              </w:rPr>
+              <w:t xml:space="preserve">background.default</w:t>
+            </w:r>
+            <w:r>
+              <w:t xml:space="preserve"> </w:t>
+            </w:r>
+            <w:r>
+              <w:t xml:space="preserve">/</w:t>
+            </w:r>
+            <w:r>
+              <w:t xml:space="preserve"> </w:t>
+            </w:r>
+            <w:r>
+              <w:rPr>
+                <w:rStyle w:val="VerbatimChar"/>
+              </w:rPr>
+              <w:t xml:space="preserve">background.paper</w:t>
+            </w:r>
+          </w:p>
+        </w:tc>
+        <w:tc>
+          <w:tcPr/>
+          <w:p>
+            <w:pPr>
+              <w:pStyle w:val="Compact"/>
+            </w:pPr>
+            <w:r>
+              <w:rPr>
+                <w:rStyle w:val="VerbatimChar"/>
+              </w:rPr>
+              <w:t xml:space="preserve">--md-bg</w:t>
+            </w:r>
+            <w:r>
+              <w:t xml:space="preserve"> </w:t>
+            </w:r>
+            <w:r>
+              <w:t xml:space="preserve">/</w:t>
+            </w:r>
+            <w:r>
+              <w:t xml:space="preserve"> </w:t>
+            </w:r>
+            <w:r>
+              <w:rPr>
+                <w:rStyle w:val="VerbatimChar"/>
+              </w:rPr>
+              <w:t xml:space="preserve">--md-surface-1</w:t>
+            </w:r>
+          </w:p>
+        </w:tc>
+      </w:tr>
+      <w:tr>
+        <w:tc>
+          <w:tcPr/>
+          <w:p>
+            <w:pPr>
+              <w:pStyle w:val="Compact"/>
+            </w:pPr>
+            <w:r>
+              <w:rPr>
+                <w:rStyle w:val="VerbatimChar"/>
+              </w:rPr>
+              <w:t xml:space="preserve">text.primary</w:t>
+            </w:r>
+            <w:r>
+              <w:t xml:space="preserve"> </w:t>
+            </w:r>
+            <w:r>
+              <w:t xml:space="preserve">/</w:t>
+            </w:r>
+            <w:r>
+              <w:t xml:space="preserve"> </w:t>
+            </w:r>
+            <w:r>
+              <w:rPr>
+                <w:rStyle w:val="VerbatimChar"/>
+              </w:rPr>
+              <w:t xml:space="preserve">text.secondary</w:t>
+            </w:r>
+          </w:p>
+        </w:tc>
+        <w:tc>
+          <w:tcPr/>
+          <w:p>
+            <w:pPr>
+              <w:pStyle w:val="Compact"/>
+            </w:pPr>
+            <w:r>
+              <w:rPr>
+                <w:rStyle w:val="VerbatimChar"/>
+              </w:rPr>
+              <w:t xml:space="preserve">--md-on-surface</w:t>
+            </w:r>
+            <w:r>
+              <w:t xml:space="preserve"> </w:t>
+            </w:r>
+            <w:r>
+              <w:t xml:space="preserve">/</w:t>
+            </w:r>
+            <w:r>
+              <w:t xml:space="preserve"> </w:t>
+            </w:r>
+            <w:r>
+              <w:rPr>
+                <w:rStyle w:val="VerbatimChar"/>
+              </w:rPr>
+              <w:t xml:space="preserve">--md-on-surface-variant</w:t>
+            </w:r>
+          </w:p>
+        </w:tc>
+      </w:tr>
+      <w:tr>
+        <w:tc>
+          <w:tcPr/>
+          <w:p>
+            <w:pPr>
+              <w:pStyle w:val="Compact"/>
+            </w:pPr>
+            <w:r>
+              <w:rPr>
+                <w:rStyle w:val="VerbatimChar"/>
+              </w:rPr>
+              <w:t xml:space="preserve">divider</w:t>
+            </w:r>
+            <w:r>
+              <w:t xml:space="preserve">,</w:t>
+            </w:r>
+            <w:r>
+              <w:t xml:space="preserve"> </w:t>
+            </w:r>
+            <w:r>
+              <w:rPr>
+                <w:rStyle w:val="VerbatimChar"/>
+              </w:rPr>
+              <w:t xml:space="preserve">outline.main</w:t>
+            </w:r>
+          </w:p>
+        </w:tc>
+        <w:tc>
+          <w:tcPr/>
+          <w:p>
+            <w:pPr>
+              <w:pStyle w:val="Compact"/>
+            </w:pPr>
+            <w:r>
+              <w:rPr>
+                <w:rStyle w:val="VerbatimChar"/>
+              </w:rPr>
+              <w:t xml:space="preserve">--md-outline-variant</w:t>
+            </w:r>
+            <w:r>
+              <w:t xml:space="preserve">,</w:t>
+            </w:r>
+            <w:r>
+              <w:t xml:space="preserve"> </w:t>
+            </w:r>
+            <w:r>
+              <w:rPr>
+                <w:rStyle w:val="VerbatimChar"/>
+              </w:rPr>
+              <w:t xml:space="preserve">--md-outline</w:t>
+            </w:r>
+          </w:p>
+        </w:tc>
+      </w:tr>
+      <w:tr>
+        <w:tc>
+          <w:tcPr/>
+          <w:p>
+            <w:pPr>
+              <w:pStyle w:val="Compact"/>
+            </w:pPr>
+            <w:r>
+              <w:rPr>
+                <w:rStyle w:val="VerbatimChar"/>
+              </w:rPr>
+              <w:t xml:space="preserve">surface.main</w:t>
+            </w:r>
+            <w:r>
+              <w:t xml:space="preserve">,</w:t>
+            </w:r>
+            <w:r>
+              <w:t xml:space="preserve"> </w:t>
+            </w:r>
+            <w:r>
+              <w:rPr>
+                <w:rStyle w:val="VerbatimChar"/>
+              </w:rPr>
+              <w:t xml:space="preserve">surface.1</w:t>
+            </w:r>
+            <w:r>
+              <w:t xml:space="preserve">…</w:t>
+            </w:r>
+            <w:r>
+              <w:rPr>
+                <w:rStyle w:val="VerbatimChar"/>
+              </w:rPr>
+              <w:t xml:space="preserve">surface.5</w:t>
+            </w:r>
+            <w:r>
+              <w:t xml:space="preserve">,</w:t>
+            </w:r>
+            <w:r>
+              <w:t xml:space="preserve"> </w:t>
+            </w:r>
+            <w:r>
+              <w:rPr>
+                <w:rStyle w:val="VerbatimChar"/>
+              </w:rPr>
+              <w:t xml:space="preserve">surface.dim</w:t>
+            </w:r>
+            <w:r>
+              <w:t xml:space="preserve">,</w:t>
+            </w:r>
+            <w:r>
+              <w:t xml:space="preserve"> </w:t>
+            </w:r>
+            <w:r>
+              <w:rPr>
+                <w:rStyle w:val="VerbatimChar"/>
+              </w:rPr>
+              <w:t xml:space="preserve">surface.bright</w:t>
+            </w:r>
+          </w:p>
+        </w:tc>
+        <w:tc>
+          <w:tcPr/>
+          <w:p>
+            <w:pPr>
+              <w:pStyle w:val="Compact"/>
+            </w:pPr>
+            <w:r>
+              <w:rPr>
+                <w:rStyle w:val="VerbatimChar"/>
+              </w:rPr>
+              <w:t xml:space="preserve">--md-surface*</w:t>
+            </w:r>
+          </w:p>
+        </w:tc>
+      </w:tr>
+      <w:tr>
+        <w:tc>
+          <w:tcPr/>
+          <w:p>
+            <w:pPr>
+              <w:pStyle w:val="Compact"/>
+            </w:pPr>
+            <w:r>
+              <w:rPr>
+                <w:rStyle w:val="VerbatimChar"/>
+              </w:rPr>
+              <w:t xml:space="preserve">status.&lt;kind&gt;.bg</w:t>
+            </w:r>
+            <w:r>
+              <w:t xml:space="preserve"> </w:t>
+            </w:r>
+            <w:r>
+              <w:t xml:space="preserve">/</w:t>
+            </w:r>
+            <w:r>
+              <w:t xml:space="preserve"> </w:t>
+            </w:r>
+            <w:r>
+              <w:rPr>
+                <w:rStyle w:val="VerbatimChar"/>
+              </w:rPr>
+              <w:t xml:space="preserve">.fg</w:t>
+            </w:r>
+          </w:p>
+        </w:tc>
+        <w:tc>
+          <w:tcPr/>
+          <w:p>
+            <w:pPr>
+              <w:pStyle w:val="Compact"/>
+            </w:pPr>
+            <w:r>
+              <w:t xml:space="preserve">§4.3</w:t>
+            </w:r>
+          </w:p>
+        </w:tc>
+      </w:tr>
+    </w:tbl>
+    <w:p>
+      <w:pPr>
+        <w:pStyle w:val="BodyText"/>
+      </w:pPr>
+      <w:r>
+        <w:t xml:space="preserve">Typography uses the Poppins stack on MUI’s stock variant sizes, plus a custom</w:t>
+      </w:r>
+      <w:r>
+        <w:t xml:space="preserve"> </w:t>
+      </w:r>
+      <w:r>
+        <w:rPr>
+          <w:rStyle w:val="VerbatimChar"/>
+        </w:rPr>
+        <w:t xml:space="preserve">script</w:t>
+      </w:r>
+      <w:r>
+        <w:t xml:space="preserve"> </w:t>
+      </w:r>
+      <w:r>
+        <w:t xml:space="preserve">variant (Caveat) and</w:t>
+      </w:r>
+      <w:r>
+        <w:t xml:space="preserve"> </w:t>
+      </w:r>
+      <w:r>
+        <w:rPr>
+          <w:rStyle w:val="VerbatimChar"/>
+        </w:rPr>
+        <w:t xml:space="preserve">theme.typography.mono</w:t>
+      </w:r>
+      <w:r>
+        <w:t xml:space="preserve"> </w:t>
+      </w:r>
+      <w:r>
+        <w:t xml:space="preserve">(JetBrains Mono). Shape, spacing and shadows are MUI defaults.</w:t>
+      </w:r>
+      <w:r>
+        <w:t xml:space="preserve"> </w:t>
+      </w:r>
+      <w:r>
+        <w:rPr>
+          <w:rStyle w:val="VerbatimChar"/>
+        </w:rPr>
+        <w:t xml:space="preserve">web/</w:t>
+      </w:r>
+      <w:r>
+        <w:t xml:space="preserve"> </w:t>
+      </w:r>
+      <w:r>
+        <w:t xml:space="preserve">should port this file into its</w:t>
+      </w:r>
+      <w:r>
+        <w:t xml:space="preserve"> </w:t>
+      </w:r>
+      <w:r>
+        <w:rPr>
+          <w:rStyle w:val="VerbatimChar"/>
+        </w:rPr>
+        <w:t xml:space="preserve">ThemeProvider</w:t>
+      </w:r>
+      <w:r>
+        <w:t xml:space="preserve"> </w:t>
+      </w:r>
+      <w:r>
+        <w:t xml:space="preserve">when the code migration starts.</w:t>
+      </w:r>
+    </w:p>
+    <w:p>
+      <w:pPr>
+        <w:pStyle w:val="BodyText"/>
+      </w:pPr>
+      <w:r>
+        <w:t xml:space="preserve">If using Tailwind (current state), extend</w:t>
       </w:r>
       <w:r>
         <w:t xml:space="preserve"> </w:t>

</xml_diff>

<commit_message>
design: take upstream's hub redirect instead of the stale all-in-one page
Checking every file this branch will push against the Claude Design
project turned up one upstream-only change: there, `Story-Tail Designs.html`
is now a redirect to pages/index.html, while the mirror still had the
original 24 KB single-page hub from the initial commit. Pushing the mirror
would have reverted the redirect, so the mirror takes upstream's version
and the hub-specific MUI wiring goes with it.

Every other file to be pushed is either identical upstream or an older
version of the local file (e.g. the 2026-09-09 move of demo emails to
example.com never reached the design project), so pushing restores it.

Co-Authored-By: Claude Opus 5.5 <noreply@anthropic.com>
</commit_message>
<xml_diff>
--- a/docs/Design-System.docx
+++ b/docs/Design-System.docx
@@ -160,13 +160,28 @@
         <w:rPr>
           <w:rStyle w:val="VerbatimChar"/>
         </w:rPr>
-        <w:t xml:space="preserve">design/source-prototype/Story-Tail Designs.html</w:t>
-      </w:r>
-      <w:r>
-        <w:t xml:space="preserve"> </w:t>
-      </w:r>
-      <w:r>
-        <w:t xml:space="preserve">(in this folder)</w:t>
+        <w:t xml:space="preserve">design/source-prototype/pages/index.html</w:t>
+      </w:r>
+      <w:r>
+        <w:t xml:space="preserve"> </w:t>
+      </w:r>
+      <w:r>
+        <w:t xml:space="preserve">(the section hub;</w:t>
+      </w:r>
+      <w:r>
+        <w:t xml:space="preserve"> </w:t>
+      </w:r>
+      <w:r>
+        <w:rPr>
+          <w:rStyle w:val="VerbatimChar"/>
+        </w:rPr>
+        <w:t xml:space="preserve">Story-Tail Designs.html</w:t>
+      </w:r>
+      <w:r>
+        <w:t xml:space="preserve"> </w:t>
+      </w:r>
+      <w:r>
+        <w:t xml:space="preserve">now just redirects there)</w:t>
       </w:r>
     </w:p>
     <w:p>

</xml_diff>

<commit_message>
docs: record MUI step 2 decisions and the web MUI rules
- Tech-Recommendations §2.3.1: step 1 done, step 2 started; Gyasi's calls
  (7 PRs by surface, MUI everywhere, keep the web layouts) and how the
  foundation fits MUI into the app (scheme selector, layers, RSC, tokens).
- Design-System §12.2 / §12.4: the web theme files and the token test,
  the fourth file that has to stay in sync.
- web/AGENTS.md: MUI rules for anyone writing web UI.
- CLAUDE.md: status line.
- Regenerated both .docx (pandoc, existing titles and author kept).

Co-Authored-By: Claude Opus 5.5 <noreply@anthropic.com>
</commit_message>
<xml_diff>
--- a/docs/Design-System.docx
+++ b/docs/Design-System.docx
@@ -12414,10 +12414,7 @@
         <w:t xml:space="preserve"> </w:t>
       </w:r>
       <w:r>
-        <w:t xml:space="preserve">implementation) — step 1 of that migration (the design source) started 2026-09-30, and</w:t>
-      </w:r>
-      <w:r>
-        <w:t xml:space="preserve"> </w:t>
+        <w:t xml:space="preserve">implementation). Step 1 (the design source) shipped 2026-10-01; step 2 (</w:t>
       </w:r>
       <w:r>
         <w:rPr>
@@ -12426,10 +12423,7 @@
         <w:t xml:space="preserve">web/</w:t>
       </w:r>
       <w:r>
-        <w:t xml:space="preserve"> </w:t>
-      </w:r>
-      <w:r>
-        <w:t xml:space="preserve">itself has not started.</w:t>
+        <w:t xml:space="preserve">) started the same day and converts one surface per PR.</w:t>
       </w:r>
     </w:p>
     <w:p>
@@ -13147,12 +13141,30 @@
       <w:r>
         <w:t xml:space="preserve">(JetBrains Mono). Shape, spacing and shadows are MUI defaults.</w:t>
       </w:r>
-      <w:r>
-        <w:t xml:space="preserve"> </w:t>
-      </w:r>
-      <w:r>
-        <w:rPr>
-          <w:rStyle w:val="VerbatimChar"/>
+    </w:p>
+    <w:p>
+      <w:pPr>
+        <w:pStyle w:val="BodyText"/>
+      </w:pPr>
+      <w:r>
+        <w:rPr>
+          <w:b/>
+          <w:bCs/>
+        </w:rPr>
+        <w:t xml:space="preserve">In</w:t>
+      </w:r>
+      <w:r>
+        <w:rPr>
+          <w:b/>
+          <w:bCs/>
+        </w:rPr>
+        <w:t xml:space="preserve"> </w:t>
+      </w:r>
+      <w:r>
+        <w:rPr>
+          <w:rStyle w:val="VerbatimChar"/>
+          <w:b/>
+          <w:bCs/>
         </w:rPr>
         <w:t xml:space="preserve">web/</w:t>
       </w:r>
@@ -13160,22 +13172,79 @@
         <w:t xml:space="preserve"> </w:t>
       </w:r>
       <w:r>
-        <w:t xml:space="preserve">should port this file into its</w:t>
-      </w:r>
-      <w:r>
-        <w:t xml:space="preserve"> </w:t>
-      </w:r>
-      <w:r>
-        <w:rPr>
-          <w:rStyle w:val="VerbatimChar"/>
-        </w:rPr>
-        <w:t xml:space="preserve">ThemeProvider</w:t>
-      </w:r>
-      <w:r>
-        <w:t xml:space="preserve"> </w:t>
-      </w:r>
-      <w:r>
-        <w:t xml:space="preserve">when the code migration starts.</w:t>
+        <w:t xml:space="preserve">the same palette lives in</w:t>
+      </w:r>
+      <w:r>
+        <w:t xml:space="preserve"> </w:t>
+      </w:r>
+      <w:r>
+        <w:rPr>
+          <w:rStyle w:val="VerbatimChar"/>
+        </w:rPr>
+        <w:t xml:space="preserve">web/lib/mui/theme.ts</w:t>
+      </w:r>
+      <w:r>
+        <w:t xml:space="preserve">, with one difference in shape: it is a single theme with CSS variables and</w:t>
+      </w:r>
+      <w:r>
+        <w:t xml:space="preserve"> </w:t>
+      </w:r>
+      <w:r>
+        <w:rPr>
+          <w:rStyle w:val="VerbatimChar"/>
+        </w:rPr>
+        <w:t xml:space="preserve">colorSchemes: { light, dark }</w:t>
+      </w:r>
+      <w:r>
+        <w:t xml:space="preserve">, keyed to the</w:t>
+      </w:r>
+      <w:r>
+        <w:t xml:space="preserve"> </w:t>
+      </w:r>
+      <w:r>
+        <w:rPr>
+          <w:rStyle w:val="VerbatimChar"/>
+        </w:rPr>
+        <w:t xml:space="preserve">.scheme-dark</w:t>
+      </w:r>
+      <w:r>
+        <w:t xml:space="preserve"> </w:t>
+      </w:r>
+      <w:r>
+        <w:t xml:space="preserve">class (</w:t>
+      </w:r>
+      <w:r>
+        <w:rPr>
+          <w:rStyle w:val="VerbatimChar"/>
+        </w:rPr>
+        <w:t xml:space="preserve">colorSchemeSelector: ".scheme-%s"</w:t>
+      </w:r>
+      <w:r>
+        <w:t xml:space="preserve">). The prototype needs two themes to show both schemes side by side; the app needs one, so the pre-paint script can switch schemes with no re-render and no flash. The palette paths in the table above are identical in both. The values themselves are in</w:t>
+      </w:r>
+      <w:r>
+        <w:t xml:space="preserve"> </w:t>
+      </w:r>
+      <w:r>
+        <w:rPr>
+          <w:rStyle w:val="VerbatimChar"/>
+        </w:rPr>
+        <w:t xml:space="preserve">web/lib/mui/tokens.ts</w:t>
+      </w:r>
+      <w:r>
+        <w:t xml:space="preserve">, which a test checks against</w:t>
+      </w:r>
+      <w:r>
+        <w:t xml:space="preserve"> </w:t>
+      </w:r>
+      <w:r>
+        <w:rPr>
+          <w:rStyle w:val="VerbatimChar"/>
+        </w:rPr>
+        <w:t xml:space="preserve">design/web-tokens/tokens.css</w:t>
+      </w:r>
+      <w:r>
+        <w:t xml:space="preserve">, so it joins the files listed in §12.4 that must stay in sync.</w:t>
       </w:r>
     </w:p>
     <w:p>
@@ -13561,7 +13630,64 @@
         <w:t xml:space="preserve"> </w:t>
       </w:r>
       <w:r>
-        <w:t xml:space="preserve">as mirror updates. Treat the three files as a single source of truth that must stay in sync — a CI check that lints for mismatched values is worth setting up early.</w:t>
+        <w:t xml:space="preserve">as mirror updates. Treat the three files as a single source of truth that must stay in sync — a CI check that lints for mismatched values is worth setting up early. With the MUI migration there is a fourth:</w:t>
+      </w:r>
+      <w:r>
+        <w:t xml:space="preserve"> </w:t>
+      </w:r>
+      <w:r>
+        <w:rPr>
+          <w:rStyle w:val="VerbatimChar"/>
+        </w:rPr>
+        <w:t xml:space="preserve">web/lib/mui/tokens.ts</w:t>
+      </w:r>
+      <w:r>
+        <w:t xml:space="preserve">, the values behind the web MUI theme. It is the first one with that CI check:</w:t>
+      </w:r>
+      <w:r>
+        <w:t xml:space="preserve"> </w:t>
+      </w:r>
+      <w:r>
+        <w:rPr>
+          <w:rStyle w:val="VerbatimChar"/>
+        </w:rPr>
+        <w:t xml:space="preserve">web/lib/mui/tokens.test.ts</w:t>
+      </w:r>
+      <w:r>
+        <w:t xml:space="preserve"> </w:t>
+      </w:r>
+      <w:r>
+        <w:t xml:space="preserve">parses</w:t>
+      </w:r>
+      <w:r>
+        <w:t xml:space="preserve"> </w:t>
+      </w:r>
+      <w:r>
+        <w:rPr>
+          <w:rStyle w:val="VerbatimChar"/>
+        </w:rPr>
+        <w:t xml:space="preserve">design/web-tokens/tokens.css</w:t>
+      </w:r>
+      <w:r>
+        <w:t xml:space="preserve"> </w:t>
+      </w:r>
+      <w:r>
+        <w:t xml:space="preserve">(and the web mirror and</w:t>
+      </w:r>
+      <w:r>
+        <w:t xml:space="preserve"> </w:t>
+      </w:r>
+      <w:r>
+        <w:rPr>
+          <w:rStyle w:val="VerbatimChar"/>
+        </w:rPr>
+        <w:t xml:space="preserve">.chip-status</w:t>
+      </w:r>
+      <w:r>
+        <w:t xml:space="preserve"> </w:t>
+      </w:r>
+      <w:r>
+        <w:t xml:space="preserve">rules) and fails on any mismatch.</w:t>
       </w:r>
     </w:p>
     <w:p>

</xml_diff>